<commit_message>
feat: Configure MongoDb with indexes - Create Config folder for mongoDB and other configs will be needed such as mail
</commit_message>
<xml_diff>
--- a/docs/plan.docx
+++ b/docs/plan.docx
@@ -32,7 +32,15 @@
     </w:p>
     <w:p>
       <w:r>
-        <w:t xml:space="preserve">Let's undo that. Here is the full, unsimplified architectural plan. This maps all 20 of your original brainstorming points into a strict, 100% event-driven microservices architecture. Since you have 6 to 7 team members, dividing the system into 6 distinct microservices is </w:t>
+        <w:t xml:space="preserve">Let's undo that. Here is the full, </w:t>
+      </w:r>
+      <w:proofErr w:type="spellStart"/>
+      <w:r>
+        <w:t>unsimplified</w:t>
+      </w:r>
+      <w:proofErr w:type="spellEnd"/>
+      <w:r>
+        <w:t xml:space="preserve"> architectural plan. This maps all 20 of your original brainstorming points into a strict, 100% event-driven microservices architecture. Since you have 6 to 7 team members, dividing the system into 6 distinct microservices is </w:t>
       </w:r>
       <w:proofErr w:type="gramStart"/>
       <w:r>
@@ -676,7 +684,15 @@
         <w:t>Workflow / Approval (#15):</w:t>
       </w:r>
       <w:r>
-        <w:t xml:space="preserve"> Listens for a LoanAppliedEvent. It routes the application to an </w:t>
+        <w:t xml:space="preserve"> Listens for a </w:t>
+      </w:r>
+      <w:proofErr w:type="spellStart"/>
+      <w:r>
+        <w:t>LoanAppliedEvent</w:t>
+      </w:r>
+      <w:proofErr w:type="spellEnd"/>
+      <w:r>
+        <w:t xml:space="preserve">. It routes the application to an </w:t>
       </w:r>
       <w:proofErr w:type="gramStart"/>
       <w:r>
@@ -684,7 +700,15 @@
       </w:r>
       <w:proofErr w:type="gramEnd"/>
       <w:r>
-        <w:t xml:space="preserve"> dashboard for manual review, then fires a LoanApprovedEvent when the employee clicks approve.</w:t>
+        <w:t xml:space="preserve"> dashboard for manual review, then fires a </w:t>
+      </w:r>
+      <w:proofErr w:type="spellStart"/>
+      <w:r>
+        <w:t>LoanApprovedEvent</w:t>
+      </w:r>
+      <w:proofErr w:type="spellEnd"/>
+      <w:r>
+        <w:t xml:space="preserve"> when the employee clicks approve.</w:t>
       </w:r>
     </w:p>
     <w:p>
@@ -702,7 +726,23 @@
         <w:t>Notification Service (#18):</w:t>
       </w:r>
       <w:r>
-        <w:t xml:space="preserve"> Listens for events (like TransferCompletedEvent or LoginDetectedEvent) and sends SMS/Emails to the user.</w:t>
+        <w:t xml:space="preserve"> Listens for events (like </w:t>
+      </w:r>
+      <w:proofErr w:type="spellStart"/>
+      <w:r>
+        <w:t>TransferCompletedEvent</w:t>
+      </w:r>
+      <w:proofErr w:type="spellEnd"/>
+      <w:r>
+        <w:t xml:space="preserve"> or </w:t>
+      </w:r>
+      <w:proofErr w:type="spellStart"/>
+      <w:r>
+        <w:t>LoginDetectedEvent</w:t>
+      </w:r>
+      <w:proofErr w:type="spellEnd"/>
+      <w:r>
+        <w:t>) and sends SMS/Emails to the user.</w:t>
       </w:r>
     </w:p>
     <w:p>
@@ -764,7 +804,7 @@
     <w:p>
       <w:r>
         <w:pict w14:anchorId="6E6166B0">
-          <v:rect id="_x0000_i1031" style="width:468pt;height:1pt" o:hralign="center" o:hrstd="t" o:hr="t" fillcolor="#a0a0a0" stroked="f"/>
+          <v:rect id="_x0000_i1025" style="width:468pt;height:1pt" o:hralign="center" o:hrstd="t" o:hr="t" fillcolor="#a0a0a0" stroked="f"/>
         </w:pict>
       </w:r>
     </w:p>
@@ -881,7 +921,15 @@
         <w:t>Docker-Compose:</w:t>
       </w:r>
       <w:r>
-        <w:t xml:space="preserve"> You will write one docker-compose.yml that boots up all 6 Spring Boot apps, your frontend, Eureka, the API Gateway, RabbitMQ, and your databases simultaneously.</w:t>
+        <w:t xml:space="preserve"> You will write one docker-</w:t>
+      </w:r>
+      <w:proofErr w:type="spellStart"/>
+      <w:r>
+        <w:t>compose.yml</w:t>
+      </w:r>
+      <w:proofErr w:type="spellEnd"/>
+      <w:r>
+        <w:t xml:space="preserve"> that boots up all 6 Spring Boot apps, your frontend, Eureka, the API Gateway, RabbitMQ, and your databases simultaneously.</w:t>
       </w:r>
     </w:p>
     <w:p>
@@ -1953,87 +2001,24 @@
   </w:abstractNum>
   <w:num w:numId="1" w16cid:durableId="407925816">
     <w:abstractNumId w:val="3"/>
-    <w:lvlOverride w:ilvl="0"/>
-    <w:lvlOverride w:ilvl="1"/>
-    <w:lvlOverride w:ilvl="2"/>
-    <w:lvlOverride w:ilvl="3"/>
-    <w:lvlOverride w:ilvl="4"/>
-    <w:lvlOverride w:ilvl="5"/>
-    <w:lvlOverride w:ilvl="6"/>
-    <w:lvlOverride w:ilvl="7"/>
-    <w:lvlOverride w:ilvl="8"/>
   </w:num>
   <w:num w:numId="2" w16cid:durableId="1051005285">
     <w:abstractNumId w:val="1"/>
-    <w:lvlOverride w:ilvl="0"/>
-    <w:lvlOverride w:ilvl="1"/>
-    <w:lvlOverride w:ilvl="2"/>
-    <w:lvlOverride w:ilvl="3"/>
-    <w:lvlOverride w:ilvl="4"/>
-    <w:lvlOverride w:ilvl="5"/>
-    <w:lvlOverride w:ilvl="6"/>
-    <w:lvlOverride w:ilvl="7"/>
-    <w:lvlOverride w:ilvl="8"/>
   </w:num>
   <w:num w:numId="3" w16cid:durableId="1930918589">
     <w:abstractNumId w:val="5"/>
-    <w:lvlOverride w:ilvl="0"/>
-    <w:lvlOverride w:ilvl="1"/>
-    <w:lvlOverride w:ilvl="2"/>
-    <w:lvlOverride w:ilvl="3"/>
-    <w:lvlOverride w:ilvl="4"/>
-    <w:lvlOverride w:ilvl="5"/>
-    <w:lvlOverride w:ilvl="6"/>
-    <w:lvlOverride w:ilvl="7"/>
-    <w:lvlOverride w:ilvl="8"/>
   </w:num>
   <w:num w:numId="4" w16cid:durableId="99834579">
     <w:abstractNumId w:val="2"/>
-    <w:lvlOverride w:ilvl="0"/>
-    <w:lvlOverride w:ilvl="1"/>
-    <w:lvlOverride w:ilvl="2"/>
-    <w:lvlOverride w:ilvl="3"/>
-    <w:lvlOverride w:ilvl="4"/>
-    <w:lvlOverride w:ilvl="5"/>
-    <w:lvlOverride w:ilvl="6"/>
-    <w:lvlOverride w:ilvl="7"/>
-    <w:lvlOverride w:ilvl="8"/>
   </w:num>
   <w:num w:numId="5" w16cid:durableId="1422141771">
     <w:abstractNumId w:val="0"/>
-    <w:lvlOverride w:ilvl="0"/>
-    <w:lvlOverride w:ilvl="1"/>
-    <w:lvlOverride w:ilvl="2"/>
-    <w:lvlOverride w:ilvl="3"/>
-    <w:lvlOverride w:ilvl="4"/>
-    <w:lvlOverride w:ilvl="5"/>
-    <w:lvlOverride w:ilvl="6"/>
-    <w:lvlOverride w:ilvl="7"/>
-    <w:lvlOverride w:ilvl="8"/>
   </w:num>
   <w:num w:numId="6" w16cid:durableId="1887568231">
     <w:abstractNumId w:val="4"/>
-    <w:lvlOverride w:ilvl="0"/>
-    <w:lvlOverride w:ilvl="1"/>
-    <w:lvlOverride w:ilvl="2"/>
-    <w:lvlOverride w:ilvl="3"/>
-    <w:lvlOverride w:ilvl="4"/>
-    <w:lvlOverride w:ilvl="5"/>
-    <w:lvlOverride w:ilvl="6"/>
-    <w:lvlOverride w:ilvl="7"/>
-    <w:lvlOverride w:ilvl="8"/>
   </w:num>
   <w:num w:numId="7" w16cid:durableId="1433747021">
     <w:abstractNumId w:val="6"/>
-    <w:lvlOverride w:ilvl="0"/>
-    <w:lvlOverride w:ilvl="1"/>
-    <w:lvlOverride w:ilvl="2"/>
-    <w:lvlOverride w:ilvl="3"/>
-    <w:lvlOverride w:ilvl="4"/>
-    <w:lvlOverride w:ilvl="5"/>
-    <w:lvlOverride w:ilvl="6"/>
-    <w:lvlOverride w:ilvl="7"/>
-    <w:lvlOverride w:ilvl="8"/>
   </w:num>
 </w:numbering>
 </file>
@@ -2641,6 +2626,7 @@
   <w:style w:type="character" w:default="1" w:styleId="DefaultParagraphFont">
     <w:name w:val="Default Paragraph Font"/>
     <w:uiPriority w:val="1"/>
+    <w:semiHidden/>
     <w:unhideWhenUsed/>
   </w:style>
   <w:style w:type="table" w:default="1" w:styleId="TableNormal">

</xml_diff>